<commit_message>
Fix: Fully populate Pertemuan 6-10 docx tables
</commit_message>
<xml_diff>
--- a/lesson-plans/lessonplan_pertemuan06.docx
+++ b/lesson-plans/lessonplan_pertemuan06.docx
@@ -179,28 +179,9 @@
             <w:vAlign w:val="center"/>
           </w:tcPr>
           <w:p>
-            <w:pPr>
-              <w:spacing w:before="60" w:after="60"/>
-              <w:rPr>
-                <w:rFonts w:ascii="Tahoma" w:eastAsia="Tahoma" w:hAnsi="Tahoma" w:cs="Tahoma"/>
-                <w:b/>
-                <w:sz w:val="22"/>
-                <w:szCs w:val="22"/>
-                <w:lang w:val="en-US"/>
-              </w:rPr>
-            </w:pPr>
-            <w:proofErr w:type="spellStart"/>
-            <w:r>
-              <w:rPr>
-                <w:rFonts w:ascii="Tahoma" w:eastAsia="Tahoma" w:hAnsi="Tahoma" w:cs="Tahoma"/>
-                <w:b/>
-                <w:sz w:val="22"/>
-                <w:szCs w:val="22"/>
-                <w:lang w:val="en-US"/>
-              </w:rPr>
+            <w:r>
               <w:t>Kejuruan</w:t>
             </w:r>
-            <w:proofErr w:type="spellEnd"/>
           </w:p>
         </w:tc>
         <w:tc>
@@ -208,6 +189,40 @@
             <w:tcW w:w="283" w:type="dxa"/>
             <w:tcBorders>
               <w:left w:val="nil"/>
+              <w:right w:val="nil"/>
+            </w:tcBorders>
+            <w:vAlign w:val="center"/>
+          </w:tcPr>
+          <w:p>
+            <w:r>
+              <w:t>:</w:t>
+            </w:r>
+          </w:p>
+        </w:tc>
+        <w:tc>
+          <w:tcPr>
+            <w:tcW w:w="2385" w:type="dxa"/>
+            <w:gridSpan w:val="3"/>
+            <w:tcBorders>
+              <w:left w:val="nil"/>
+            </w:tcBorders>
+            <w:vAlign w:val="center"/>
+          </w:tcPr>
+          <w:p>
+            <w:r>
+              <w:t>Teknologi Informasi dan Komunikasi (TIK)</w:t>
+            </w:r>
+          </w:p>
+        </w:tc>
+      </w:tr>
+      <w:tr>
+        <w:trPr>
+          <w:trHeight w:val="278"/>
+        </w:trPr>
+        <w:tc>
+          <w:tcPr>
+            <w:tcW w:w="1962" w:type="dxa"/>
+            <w:tcBorders>
               <w:right w:val="nil"/>
             </w:tcBorders>
             <w:vAlign w:val="center"/>
@@ -229,34 +244,15 @@
                 <w:sz w:val="22"/>
                 <w:szCs w:val="22"/>
               </w:rPr>
-              <w:t>:</w:t>
-            </w:r>
-          </w:p>
-        </w:tc>
-        <w:tc>
-          <w:tcPr>
-            <w:tcW w:w="2385" w:type="dxa"/>
-            <w:gridSpan w:val="3"/>
+              <w:t>Kode Unit Kompetensi</w:t>
+            </w:r>
+          </w:p>
+        </w:tc>
+        <w:tc>
+          <w:tcPr>
+            <w:tcW w:w="296" w:type="dxa"/>
             <w:tcBorders>
               <w:left w:val="nil"/>
-            </w:tcBorders>
-            <w:vAlign w:val="center"/>
-          </w:tcPr>
-          <w:p>
-            <w:r>
-              <w:t>TIK</w:t>
-            </w:r>
-          </w:p>
-        </w:tc>
-      </w:tr>
-      <w:tr>
-        <w:trPr>
-          <w:trHeight w:val="278"/>
-        </w:trPr>
-        <w:tc>
-          <w:tcPr>
-            <w:tcW w:w="1962" w:type="dxa"/>
-            <w:tcBorders>
               <w:right w:val="nil"/>
             </w:tcBorders>
             <w:vAlign w:val="center"/>
@@ -278,15 +274,79 @@
                 <w:sz w:val="22"/>
                 <w:szCs w:val="22"/>
               </w:rPr>
-              <w:t>Kode Unit Kompetensi</w:t>
-            </w:r>
-          </w:p>
-        </w:tc>
-        <w:tc>
-          <w:tcPr>
-            <w:tcW w:w="296" w:type="dxa"/>
+              <w:t>:</w:t>
+            </w:r>
+          </w:p>
+        </w:tc>
+        <w:tc>
+          <w:tcPr>
+            <w:tcW w:w="2994" w:type="dxa"/>
+            <w:gridSpan w:val="2"/>
             <w:tcBorders>
               <w:left w:val="nil"/>
+            </w:tcBorders>
+            <w:vAlign w:val="center"/>
+          </w:tcPr>
+          <w:p>
+            <w:r>
+              <w:t>M.74DKV13.012.2</w:t>
+            </w:r>
+          </w:p>
+        </w:tc>
+        <w:tc>
+          <w:tcPr>
+            <w:tcW w:w="1944" w:type="dxa"/>
+            <w:gridSpan w:val="2"/>
+            <w:tcBorders>
+              <w:right w:val="nil"/>
+            </w:tcBorders>
+            <w:vAlign w:val="center"/>
+          </w:tcPr>
+          <w:p>
+            <w:r>
+              <w:t>Penyajian ke</w:t>
+            </w:r>
+          </w:p>
+        </w:tc>
+        <w:tc>
+          <w:tcPr>
+            <w:tcW w:w="283" w:type="dxa"/>
+            <w:tcBorders>
+              <w:left w:val="nil"/>
+              <w:right w:val="nil"/>
+            </w:tcBorders>
+            <w:vAlign w:val="center"/>
+          </w:tcPr>
+          <w:p>
+            <w:r>
+              <w:t>:</w:t>
+            </w:r>
+          </w:p>
+        </w:tc>
+        <w:tc>
+          <w:tcPr>
+            <w:tcW w:w="2385" w:type="dxa"/>
+            <w:gridSpan w:val="3"/>
+            <w:tcBorders>
+              <w:left w:val="nil"/>
+            </w:tcBorders>
+            <w:vAlign w:val="center"/>
+          </w:tcPr>
+          <w:p>
+            <w:r>
+              <w:t>6</w:t>
+            </w:r>
+          </w:p>
+        </w:tc>
+      </w:tr>
+      <w:tr>
+        <w:trPr>
+          <w:trHeight w:val="60"/>
+        </w:trPr>
+        <w:tc>
+          <w:tcPr>
+            <w:tcW w:w="1962" w:type="dxa"/>
+            <w:tcBorders>
               <w:right w:val="nil"/>
             </w:tcBorders>
             <w:vAlign w:val="center"/>
@@ -308,30 +368,15 @@
                 <w:sz w:val="22"/>
                 <w:szCs w:val="22"/>
               </w:rPr>
-              <w:t>:</w:t>
-            </w:r>
-          </w:p>
-        </w:tc>
-        <w:tc>
-          <w:tcPr>
-            <w:tcW w:w="2994" w:type="dxa"/>
-            <w:gridSpan w:val="2"/>
+              <w:t>Judul Unit Kompetensi</w:t>
+            </w:r>
+          </w:p>
+        </w:tc>
+        <w:tc>
+          <w:tcPr>
+            <w:tcW w:w="296" w:type="dxa"/>
             <w:tcBorders>
               <w:left w:val="nil"/>
-            </w:tcBorders>
-            <w:vAlign w:val="center"/>
-          </w:tcPr>
-          <w:p>
-            <w:r>
-              <w:t>M.74DKV13.012.2</w:t>
-            </w:r>
-          </w:p>
-        </w:tc>
-        <w:tc>
-          <w:tcPr>
-            <w:tcW w:w="1944" w:type="dxa"/>
-            <w:gridSpan w:val="2"/>
-            <w:tcBorders>
               <w:right w:val="nil"/>
             </w:tcBorders>
             <w:vAlign w:val="center"/>
@@ -353,7 +398,37 @@
                 <w:sz w:val="22"/>
                 <w:szCs w:val="22"/>
               </w:rPr>
-              <w:t>Penyajian ke</w:t>
+              <w:t>:</w:t>
+            </w:r>
+          </w:p>
+        </w:tc>
+        <w:tc>
+          <w:tcPr>
+            <w:tcW w:w="2994" w:type="dxa"/>
+            <w:gridSpan w:val="2"/>
+            <w:tcBorders>
+              <w:left w:val="nil"/>
+            </w:tcBorders>
+            <w:vAlign w:val="center"/>
+          </w:tcPr>
+          <w:p>
+            <w:r>
+              <w:t>Menciptakan Karya Desain</w:t>
+            </w:r>
+          </w:p>
+        </w:tc>
+        <w:tc>
+          <w:tcPr>
+            <w:tcW w:w="1944" w:type="dxa"/>
+            <w:gridSpan w:val="2"/>
+            <w:tcBorders>
+              <w:right w:val="nil"/>
+            </w:tcBorders>
+            <w:vAlign w:val="center"/>
+          </w:tcPr>
+          <w:p>
+            <w:r>
+              <w:t>Waktu</w:t>
             </w:r>
           </w:p>
         </w:tc>
@@ -367,22 +442,7 @@
             <w:vAlign w:val="center"/>
           </w:tcPr>
           <w:p>
-            <w:pPr>
-              <w:spacing w:before="60" w:after="60"/>
-              <w:rPr>
-                <w:rFonts w:ascii="Tahoma" w:eastAsia="Tahoma" w:hAnsi="Tahoma" w:cs="Tahoma"/>
-                <w:b/>
-                <w:sz w:val="22"/>
-                <w:szCs w:val="22"/>
-              </w:rPr>
-            </w:pPr>
-            <w:r>
-              <w:rPr>
-                <w:rFonts w:ascii="Tahoma" w:eastAsia="Tahoma" w:hAnsi="Tahoma" w:cs="Tahoma"/>
-                <w:b/>
-                <w:sz w:val="22"/>
-                <w:szCs w:val="22"/>
-              </w:rPr>
+            <w:r>
               <w:t>:</w:t>
             </w:r>
           </w:p>
@@ -398,166 +458,20 @@
           </w:tcPr>
           <w:p>
             <w:r>
-              <w:t>6</w:t>
+              <w:t>180 menit</w:t>
             </w:r>
           </w:p>
         </w:tc>
       </w:tr>
       <w:tr>
-        <w:trPr>
-          <w:trHeight w:val="60"/>
-        </w:trPr>
-        <w:tc>
-          <w:tcPr>
-            <w:tcW w:w="1962" w:type="dxa"/>
-            <w:tcBorders>
-              <w:right w:val="nil"/>
-            </w:tcBorders>
-            <w:vAlign w:val="center"/>
-          </w:tcPr>
-          <w:p>
-            <w:pPr>
-              <w:spacing w:before="60" w:after="60"/>
-              <w:rPr>
-                <w:rFonts w:ascii="Tahoma" w:eastAsia="Tahoma" w:hAnsi="Tahoma" w:cs="Tahoma"/>
-                <w:b/>
-                <w:sz w:val="22"/>
-                <w:szCs w:val="22"/>
-              </w:rPr>
-            </w:pPr>
-            <w:r>
-              <w:rPr>
-                <w:rFonts w:ascii="Tahoma" w:eastAsia="Tahoma" w:hAnsi="Tahoma" w:cs="Tahoma"/>
-                <w:b/>
-                <w:sz w:val="22"/>
-                <w:szCs w:val="22"/>
-              </w:rPr>
-              <w:t>Judul Unit Kompetensi</w:t>
-            </w:r>
-          </w:p>
-        </w:tc>
-        <w:tc>
-          <w:tcPr>
-            <w:tcW w:w="296" w:type="dxa"/>
-            <w:tcBorders>
-              <w:left w:val="nil"/>
-              <w:right w:val="nil"/>
-            </w:tcBorders>
-            <w:vAlign w:val="center"/>
-          </w:tcPr>
-          <w:p>
-            <w:pPr>
-              <w:spacing w:before="60" w:after="60"/>
-              <w:rPr>
-                <w:rFonts w:ascii="Tahoma" w:eastAsia="Tahoma" w:hAnsi="Tahoma" w:cs="Tahoma"/>
-                <w:b/>
-                <w:sz w:val="22"/>
-                <w:szCs w:val="22"/>
-              </w:rPr>
-            </w:pPr>
-            <w:r>
-              <w:rPr>
-                <w:rFonts w:ascii="Tahoma" w:eastAsia="Tahoma" w:hAnsi="Tahoma" w:cs="Tahoma"/>
-                <w:b/>
-                <w:sz w:val="22"/>
-                <w:szCs w:val="22"/>
-              </w:rPr>
-              <w:t>:</w:t>
-            </w:r>
-          </w:p>
-        </w:tc>
-        <w:tc>
-          <w:tcPr>
-            <w:tcW w:w="2994" w:type="dxa"/>
-            <w:gridSpan w:val="2"/>
-            <w:tcBorders>
-              <w:left w:val="nil"/>
-            </w:tcBorders>
-            <w:vAlign w:val="center"/>
-          </w:tcPr>
-          <w:p>
-            <w:pPr>
-              <w:spacing w:before="60" w:after="60"/>
-              <w:rPr>
-                <w:rFonts w:ascii="Tahoma" w:eastAsia="Tahoma" w:hAnsi="Tahoma" w:cs="Tahoma"/>
-                <w:sz w:val="22"/>
-                <w:szCs w:val="22"/>
-              </w:rPr>
-            </w:pPr>
-          </w:p>
-        </w:tc>
-        <w:tc>
-          <w:tcPr>
-            <w:tcW w:w="1944" w:type="dxa"/>
-            <w:gridSpan w:val="2"/>
-            <w:tcBorders>
-              <w:right w:val="nil"/>
-            </w:tcBorders>
-            <w:vAlign w:val="center"/>
-          </w:tcPr>
-          <w:p>
-            <w:pPr>
-              <w:spacing w:before="60" w:after="60"/>
-              <w:rPr>
-                <w:rFonts w:ascii="Tahoma" w:eastAsia="Tahoma" w:hAnsi="Tahoma" w:cs="Tahoma"/>
-                <w:b/>
-                <w:sz w:val="22"/>
-                <w:szCs w:val="22"/>
-              </w:rPr>
-            </w:pPr>
-            <w:r>
-              <w:rPr>
-                <w:rFonts w:ascii="Tahoma" w:eastAsia="Tahoma" w:hAnsi="Tahoma" w:cs="Tahoma"/>
-                <w:b/>
-                <w:sz w:val="22"/>
-                <w:szCs w:val="22"/>
-              </w:rPr>
-              <w:t xml:space="preserve">Waktu </w:t>
-            </w:r>
-          </w:p>
-        </w:tc>
-        <w:tc>
-          <w:tcPr>
-            <w:tcW w:w="283" w:type="dxa"/>
-            <w:tcBorders>
-              <w:left w:val="nil"/>
-              <w:right w:val="nil"/>
-            </w:tcBorders>
-            <w:vAlign w:val="center"/>
-          </w:tcPr>
-          <w:p>
-            <w:pPr>
-              <w:spacing w:before="60" w:after="60"/>
-              <w:rPr>
-                <w:rFonts w:ascii="Tahoma" w:eastAsia="Tahoma" w:hAnsi="Tahoma" w:cs="Tahoma"/>
-                <w:b/>
-                <w:sz w:val="22"/>
-                <w:szCs w:val="22"/>
-              </w:rPr>
-            </w:pPr>
-            <w:r>
-              <w:rPr>
-                <w:rFonts w:ascii="Tahoma" w:eastAsia="Tahoma" w:hAnsi="Tahoma" w:cs="Tahoma"/>
-                <w:b/>
-                <w:sz w:val="22"/>
-                <w:szCs w:val="22"/>
-              </w:rPr>
-              <w:t>:</w:t>
-            </w:r>
-          </w:p>
-        </w:tc>
-        <w:tc>
-          <w:tcPr>
-            <w:tcW w:w="2385" w:type="dxa"/>
-            <w:gridSpan w:val="3"/>
-            <w:tcBorders>
-              <w:left w:val="nil"/>
-            </w:tcBorders>
-            <w:vAlign w:val="center"/>
-          </w:tcPr>
-          <w:p>
-            <w:r>
-              <w:t>180 menit</w:t>
+        <w:tc>
+          <w:tcPr>
+            <w:tcW w:w="9864" w:type="dxa"/>
+            <w:gridSpan w:val="10"/>
+          </w:tcPr>
+          <w:p>
+            <w:r>
+              <w:t>Pengembangan Prototipe Desain Grafis (Sketsa &amp; Thumbnail)</w:t>
             </w:r>
           </w:p>
         </w:tc>
@@ -570,20 +484,7 @@
           </w:tcPr>
           <w:p>
             <w:r>
-              <w:t>Pengembangan Prototipe (Sketsa &amp; Thumbnail)</w:t>
-            </w:r>
-          </w:p>
-        </w:tc>
-      </w:tr>
-      <w:tr>
-        <w:tc>
-          <w:tcPr>
-            <w:tcW w:w="9864" w:type="dxa"/>
-            <w:gridSpan w:val="10"/>
-          </w:tcPr>
-          <w:p>
-            <w:r>
-              <w:t>Mengembangkan sketsa kasar menjadi prototipe digital mockup.</w:t>
+              <w:t>Setelah selesai mengikuti pelatihan ini peserta kompeten dalam mengembangkan sketsa desain grafis menjadi prototipe digital (mockup) pada perangkat lunak desain secara optimal sesuai dengan arahan pada design brief.</w:t>
             </w:r>
           </w:p>
         </w:tc>
@@ -601,6 +502,72 @@
             <w:tcBorders>
               <w:bottom w:val="single" w:sz="4" w:space="0" w:color="000000"/>
             </w:tcBorders>
+          </w:tcPr>
+          <w:p>
+            <w:r>
+              <w:t>Metode Mengajar</w:t>
+            </w:r>
+          </w:p>
+        </w:tc>
+        <w:tc>
+          <w:tcPr>
+            <w:tcW w:w="7189" w:type="dxa"/>
+            <w:gridSpan w:val="6"/>
+          </w:tcPr>
+          <w:p>
+            <w:r>
+              <w:t>Ceramah</w:t>
+              <w:br/>
+              <w:t>Praktikum</w:t>
+              <w:br/>
+              <w:t>Diskusi</w:t>
+            </w:r>
+          </w:p>
+        </w:tc>
+      </w:tr>
+      <w:tr>
+        <w:trPr>
+          <w:gridAfter w:val="1"/>
+          <w:wAfter w:w="10" w:type="dxa"/>
+          <w:trHeight w:val="754"/>
+        </w:trPr>
+        <w:tc>
+          <w:tcPr>
+            <w:tcW w:w="2665" w:type="dxa"/>
+            <w:gridSpan w:val="3"/>
+            <w:vMerge w:val="restart"/>
+          </w:tcPr>
+          <w:p>
+            <w:r>
+              <w:t>Media Pembelajaran</w:t>
+              <w:br/>
+              <w:t>(Media, Alat, Bahan)</w:t>
+            </w:r>
+          </w:p>
+        </w:tc>
+        <w:tc>
+          <w:tcPr>
+            <w:tcW w:w="7189" w:type="dxa"/>
+            <w:gridSpan w:val="6"/>
+          </w:tcPr>
+          <w:p>
+            <w:r>
+              <w:t>Media Power Point, Gambar dan Video Contoh Sketsa &amp; Prototipe</w:t>
+            </w:r>
+          </w:p>
+        </w:tc>
+      </w:tr>
+      <w:tr>
+        <w:trPr>
+          <w:gridAfter w:val="1"/>
+          <w:wAfter w:w="10" w:type="dxa"/>
+          <w:trHeight w:val="754"/>
+        </w:trPr>
+        <w:tc>
+          <w:tcPr>
+            <w:tcW w:w="2665" w:type="dxa"/>
+            <w:gridSpan w:val="3"/>
+            <w:vMerge/>
           </w:tcPr>
           <w:p>
             <w:pPr>
@@ -613,15 +580,6 @@
                 <w:szCs w:val="22"/>
               </w:rPr>
             </w:pPr>
-            <w:r>
-              <w:rPr>
-                <w:rFonts w:ascii="Tahoma" w:eastAsia="Tahoma" w:hAnsi="Tahoma" w:cs="Tahoma"/>
-                <w:b/>
-                <w:sz w:val="22"/>
-                <w:szCs w:val="22"/>
-              </w:rPr>
-              <w:t>Metode Mengajar</w:t>
-            </w:r>
           </w:p>
         </w:tc>
         <w:tc>
@@ -630,28 +588,9 @@
             <w:gridSpan w:val="6"/>
           </w:tcPr>
           <w:p>
-            <w:pPr>
-              <w:numPr>
-                <w:ilvl w:val="0"/>
-                <w:numId w:val="2"/>
-              </w:numPr>
-              <w:pBdr>
-                <w:top w:val="nil"/>
-                <w:left w:val="nil"/>
-                <w:bottom w:val="nil"/>
-                <w:right w:val="nil"/>
-                <w:between w:val="nil"/>
-              </w:pBdr>
-              <w:spacing w:after="120"/>
-              <w:ind w:left="294" w:hanging="284"/>
-              <w:jc w:val="both"/>
-              <w:rPr>
-                <w:rFonts w:ascii="Tahoma" w:eastAsia="Tahoma" w:hAnsi="Tahoma" w:cs="Tahoma"/>
-                <w:color w:val="000000" w:themeColor="text1"/>
-                <w:sz w:val="22"/>
-                <w:szCs w:val="22"/>
-              </w:rPr>
-            </w:pPr>
+            <w:r>
+              <w:t>Alat Proyektor dan Layar, UPS dan Perangkat Komputer, Papan Tulis, Spidol dan Penghapus</w:t>
+            </w:r>
           </w:p>
         </w:tc>
       </w:tr>
@@ -665,7 +604,10 @@
           <w:tcPr>
             <w:tcW w:w="2665" w:type="dxa"/>
             <w:gridSpan w:val="3"/>
-            <w:vMerge w:val="restart"/>
+            <w:vMerge/>
+            <w:tcBorders>
+              <w:bottom w:val="nil"/>
+            </w:tcBorders>
           </w:tcPr>
           <w:p>
             <w:pPr>
@@ -678,43 +620,6 @@
                 <w:szCs w:val="22"/>
               </w:rPr>
             </w:pPr>
-            <w:r>
-              <w:rPr>
-                <w:rFonts w:ascii="Tahoma" w:eastAsia="Tahoma" w:hAnsi="Tahoma" w:cs="Tahoma"/>
-                <w:b/>
-                <w:sz w:val="22"/>
-                <w:szCs w:val="22"/>
-              </w:rPr>
-              <w:t>Media Pembelajaran</w:t>
-            </w:r>
-          </w:p>
-          <w:p>
-            <w:pPr>
-              <w:jc w:val="both"/>
-              <w:rPr>
-                <w:rFonts w:ascii="Tahoma" w:eastAsia="Tahoma" w:hAnsi="Tahoma" w:cs="Tahoma"/>
-                <w:sz w:val="22"/>
-                <w:szCs w:val="22"/>
-              </w:rPr>
-            </w:pPr>
-            <w:r>
-              <w:rPr>
-                <w:rFonts w:ascii="Tahoma" w:eastAsia="Tahoma" w:hAnsi="Tahoma" w:cs="Tahoma"/>
-                <w:sz w:val="22"/>
-                <w:szCs w:val="22"/>
-              </w:rPr>
-              <w:t>(Media, Alat, Bahan)</w:t>
-            </w:r>
-          </w:p>
-          <w:p>
-            <w:pPr>
-              <w:jc w:val="both"/>
-              <w:rPr>
-                <w:rFonts w:ascii="Tahoma" w:eastAsia="Tahoma" w:hAnsi="Tahoma" w:cs="Tahoma"/>
-                <w:sz w:val="22"/>
-                <w:szCs w:val="22"/>
-              </w:rPr>
-            </w:pPr>
           </w:p>
         </w:tc>
         <w:tc>
@@ -723,230 +628,9 @@
             <w:gridSpan w:val="6"/>
           </w:tcPr>
           <w:p>
-            <w:pPr>
-              <w:pBdr>
-                <w:top w:val="nil"/>
-                <w:left w:val="nil"/>
-                <w:bottom w:val="nil"/>
-                <w:right w:val="nil"/>
-                <w:between w:val="nil"/>
-              </w:pBdr>
-              <w:spacing w:before="120" w:line="276" w:lineRule="auto"/>
-              <w:ind w:left="52"/>
-              <w:jc w:val="both"/>
-              <w:rPr>
-                <w:rFonts w:ascii="Tahoma" w:eastAsia="Tahoma" w:hAnsi="Tahoma" w:cs="Tahoma"/>
-                <w:color w:val="000000" w:themeColor="text1"/>
-                <w:sz w:val="22"/>
-                <w:szCs w:val="22"/>
-              </w:rPr>
-            </w:pPr>
-            <w:r>
-              <w:rPr>
-                <w:rFonts w:ascii="Tahoma" w:eastAsia="Tahoma" w:hAnsi="Tahoma" w:cs="Tahoma"/>
-                <w:color w:val="000000" w:themeColor="text1"/>
-                <w:sz w:val="22"/>
-                <w:szCs w:val="22"/>
-              </w:rPr>
-              <w:t>Media</w:t>
-            </w:r>
-          </w:p>
-          <w:p>
-            <w:pPr>
-              <w:numPr>
-                <w:ilvl w:val="0"/>
-                <w:numId w:val="3"/>
-              </w:numPr>
-              <w:pBdr>
-                <w:top w:val="nil"/>
-                <w:left w:val="nil"/>
-                <w:bottom w:val="nil"/>
-                <w:right w:val="nil"/>
-                <w:between w:val="nil"/>
-              </w:pBdr>
-              <w:spacing w:after="120" w:line="276" w:lineRule="auto"/>
-              <w:ind w:left="294" w:hanging="242"/>
-              <w:jc w:val="both"/>
-              <w:rPr>
-                <w:rFonts w:ascii="Tahoma" w:eastAsia="Tahoma" w:hAnsi="Tahoma" w:cs="Tahoma"/>
-                <w:color w:val="000000" w:themeColor="text1"/>
-                <w:sz w:val="22"/>
-                <w:szCs w:val="22"/>
-              </w:rPr>
-            </w:pPr>
-          </w:p>
-        </w:tc>
-      </w:tr>
-      <w:tr>
-        <w:trPr>
-          <w:gridAfter w:val="1"/>
-          <w:wAfter w:w="10" w:type="dxa"/>
-          <w:trHeight w:val="754"/>
-        </w:trPr>
-        <w:tc>
-          <w:tcPr>
-            <w:tcW w:w="2665" w:type="dxa"/>
-            <w:gridSpan w:val="3"/>
-            <w:vMerge/>
-          </w:tcPr>
-          <w:p>
-            <w:pPr>
-              <w:spacing w:before="120"/>
-              <w:jc w:val="both"/>
-              <w:rPr>
-                <w:rFonts w:ascii="Tahoma" w:eastAsia="Tahoma" w:hAnsi="Tahoma" w:cs="Tahoma"/>
-                <w:b/>
-                <w:sz w:val="22"/>
-                <w:szCs w:val="22"/>
-              </w:rPr>
-            </w:pPr>
-          </w:p>
-        </w:tc>
-        <w:tc>
-          <w:tcPr>
-            <w:tcW w:w="7189" w:type="dxa"/>
-            <w:gridSpan w:val="6"/>
-          </w:tcPr>
-          <w:p>
-            <w:pPr>
-              <w:pBdr>
-                <w:top w:val="nil"/>
-                <w:left w:val="nil"/>
-                <w:bottom w:val="nil"/>
-                <w:right w:val="nil"/>
-                <w:between w:val="nil"/>
-              </w:pBdr>
-              <w:spacing w:before="120" w:line="276" w:lineRule="auto"/>
-              <w:ind w:left="52"/>
-              <w:jc w:val="both"/>
-              <w:rPr>
-                <w:rFonts w:ascii="Tahoma" w:eastAsia="Tahoma" w:hAnsi="Tahoma" w:cs="Tahoma"/>
-                <w:color w:val="000000" w:themeColor="text1"/>
-                <w:sz w:val="22"/>
-                <w:szCs w:val="22"/>
-              </w:rPr>
-            </w:pPr>
-            <w:r>
-              <w:rPr>
-                <w:rFonts w:ascii="Tahoma" w:eastAsia="Tahoma" w:hAnsi="Tahoma" w:cs="Tahoma"/>
-                <w:color w:val="000000" w:themeColor="text1"/>
-                <w:sz w:val="22"/>
-                <w:szCs w:val="22"/>
-              </w:rPr>
-              <w:t>Alat</w:t>
-            </w:r>
-          </w:p>
-          <w:p>
-            <w:pPr>
-              <w:numPr>
-                <w:ilvl w:val="0"/>
-                <w:numId w:val="7"/>
-              </w:numPr>
-              <w:pBdr>
-                <w:top w:val="nil"/>
-                <w:left w:val="nil"/>
-                <w:bottom w:val="nil"/>
-                <w:right w:val="nil"/>
-                <w:between w:val="nil"/>
-              </w:pBdr>
-              <w:spacing w:after="120" w:line="276" w:lineRule="auto"/>
-              <w:ind w:left="294" w:hanging="242"/>
-              <w:jc w:val="both"/>
-              <w:rPr>
-                <w:rFonts w:ascii="Tahoma" w:eastAsia="Tahoma" w:hAnsi="Tahoma" w:cs="Tahoma"/>
-                <w:color w:val="000000" w:themeColor="text1"/>
-                <w:sz w:val="22"/>
-                <w:szCs w:val="22"/>
-              </w:rPr>
-            </w:pPr>
-          </w:p>
-        </w:tc>
-      </w:tr>
-      <w:tr>
-        <w:trPr>
-          <w:gridAfter w:val="1"/>
-          <w:wAfter w:w="10" w:type="dxa"/>
-          <w:trHeight w:val="754"/>
-        </w:trPr>
-        <w:tc>
-          <w:tcPr>
-            <w:tcW w:w="2665" w:type="dxa"/>
-            <w:gridSpan w:val="3"/>
-            <w:vMerge/>
-            <w:tcBorders>
-              <w:bottom w:val="nil"/>
-            </w:tcBorders>
-          </w:tcPr>
-          <w:p>
-            <w:pPr>
-              <w:spacing w:before="120"/>
-              <w:jc w:val="both"/>
-              <w:rPr>
-                <w:rFonts w:ascii="Tahoma" w:eastAsia="Tahoma" w:hAnsi="Tahoma" w:cs="Tahoma"/>
-                <w:b/>
-                <w:sz w:val="22"/>
-                <w:szCs w:val="22"/>
-              </w:rPr>
-            </w:pPr>
-          </w:p>
-        </w:tc>
-        <w:tc>
-          <w:tcPr>
-            <w:tcW w:w="7189" w:type="dxa"/>
-            <w:gridSpan w:val="6"/>
-          </w:tcPr>
-          <w:p>
-            <w:pPr>
-              <w:pBdr>
-                <w:top w:val="nil"/>
-                <w:left w:val="nil"/>
-                <w:bottom w:val="nil"/>
-                <w:right w:val="nil"/>
-                <w:between w:val="nil"/>
-              </w:pBdr>
-              <w:spacing w:before="120" w:line="276" w:lineRule="auto"/>
-              <w:ind w:left="52"/>
-              <w:jc w:val="both"/>
-              <w:rPr>
-                <w:rFonts w:ascii="Tahoma" w:eastAsia="Tahoma" w:hAnsi="Tahoma" w:cs="Tahoma"/>
-                <w:color w:val="000000" w:themeColor="text1"/>
-                <w:sz w:val="22"/>
-                <w:szCs w:val="22"/>
-              </w:rPr>
-            </w:pPr>
-            <w:r>
-              <w:rPr>
-                <w:rFonts w:ascii="Tahoma" w:eastAsia="Tahoma" w:hAnsi="Tahoma" w:cs="Tahoma"/>
-                <w:color w:val="000000" w:themeColor="text1"/>
-                <w:sz w:val="22"/>
-                <w:szCs w:val="22"/>
-              </w:rPr>
-              <w:t>Bahan</w:t>
-            </w:r>
-          </w:p>
-          <w:p>
-            <w:pPr>
-              <w:numPr>
-                <w:ilvl w:val="0"/>
-                <w:numId w:val="8"/>
-              </w:numPr>
-              <w:pBdr>
-                <w:top w:val="nil"/>
-                <w:left w:val="nil"/>
-                <w:bottom w:val="nil"/>
-                <w:right w:val="nil"/>
-                <w:between w:val="nil"/>
-              </w:pBdr>
-              <w:spacing w:after="120" w:line="276" w:lineRule="auto"/>
-              <w:ind w:left="294" w:hanging="242"/>
-              <w:jc w:val="both"/>
-              <w:rPr>
-                <w:rFonts w:ascii="Tahoma" w:eastAsia="Tahoma" w:hAnsi="Tahoma" w:cs="Tahoma"/>
-                <w:color w:val="000000" w:themeColor="text1"/>
-                <w:sz w:val="22"/>
-                <w:szCs w:val="22"/>
-              </w:rPr>
-            </w:pPr>
+            <w:r>
+              <w:t>Bahan Flashdisk, Canva / Software Desain (CorelDraw/Illustrator/Photoshop), Buku Sketsa &amp; Pensil</w:t>
+            </w:r>
           </w:p>
         </w:tc>
       </w:tr>
@@ -988,21 +672,9 @@
             <w:gridSpan w:val="6"/>
           </w:tcPr>
           <w:p>
-            <w:pPr>
-              <w:numPr>
-                <w:ilvl w:val="0"/>
-                <w:numId w:val="5"/>
-              </w:numPr>
-              <w:spacing w:after="120" w:line="276" w:lineRule="auto"/>
-              <w:ind w:left="294" w:hanging="284"/>
-              <w:jc w:val="both"/>
-              <w:rPr>
-                <w:rFonts w:ascii="Tahoma" w:eastAsia="Tahoma" w:hAnsi="Tahoma" w:cs="Tahoma"/>
-                <w:color w:val="000000" w:themeColor="text1"/>
-                <w:sz w:val="22"/>
-                <w:szCs w:val="22"/>
-              </w:rPr>
-            </w:pPr>
+            <w:r>
+              <w:t>Persiapan</w:t>
+            </w:r>
           </w:p>
         </w:tc>
       </w:tr>
@@ -1050,9 +722,17 @@
           </w:tcPr>
           <w:p>
             <w:r>
-              <w:t>1. Salam</w:t>
+              <w:t>1. Memberi salam dan Memperkenalkan diri</w:t>
               <w:br/>
-              <w:t>2. Apersepsi: Pentingnya draft sebelum ngoding/desain</w:t>
+              <w:t>2. Mengabsen peserta pelatihan</w:t>
+              <w:br/>
+              <w:t>3. Menjelaskan safety induction dan rules</w:t>
+              <w:br/>
+              <w:t>4. Mengadakan apersepsi mengenai pentingnya sketsa kasar</w:t>
+              <w:br/>
+              <w:t>5. Menyampaikan judul unit dan roadmap pelatihan</w:t>
+              <w:br/>
+              <w:t>6. Menyampaikan tujuan dan manfaat belajar</w:t>
             </w:r>
           </w:p>
         </w:tc>
@@ -1061,24 +741,7 @@
             <w:tcW w:w="1850" w:type="dxa"/>
           </w:tcPr>
           <w:p>
-            <w:pPr>
-              <w:spacing w:before="120" w:after="120"/>
-              <w:ind w:left="26"/>
-              <w:jc w:val="center"/>
-              <w:rPr>
-                <w:rFonts w:ascii="Tahoma" w:eastAsia="Tahoma" w:hAnsi="Tahoma" w:cs="Tahoma"/>
-                <w:b/>
-                <w:sz w:val="22"/>
-                <w:szCs w:val="22"/>
-              </w:rPr>
-            </w:pPr>
-            <w:r>
-              <w:rPr>
-                <w:rFonts w:ascii="Tahoma" w:eastAsia="Tahoma" w:hAnsi="Tahoma" w:cs="Tahoma"/>
-                <w:b/>
-                <w:sz w:val="22"/>
-                <w:szCs w:val="22"/>
-              </w:rPr>
+            <w:r>
               <w:t>Perkiraan Waktu</w:t>
             </w:r>
           </w:p>
@@ -1145,15 +808,9 @@
             <w:tcW w:w="1850" w:type="dxa"/>
           </w:tcPr>
           <w:p>
-            <w:pPr>
-              <w:ind w:left="26"/>
-              <w:jc w:val="center"/>
-              <w:rPr>
-                <w:rFonts w:ascii="Tahoma" w:eastAsia="Tahoma" w:hAnsi="Tahoma" w:cs="Tahoma"/>
-                <w:sz w:val="22"/>
-                <w:szCs w:val="22"/>
-              </w:rPr>
-            </w:pPr>
+            <w:r>
+              <w:t>10 menit</w:t>
+            </w:r>
           </w:p>
         </w:tc>
       </w:tr>
@@ -1172,25 +829,7 @@
             <w:vAlign w:val="center"/>
           </w:tcPr>
           <w:p>
-            <w:pPr>
-              <w:pStyle w:val="ListParagraph"/>
-              <w:numPr>
-                <w:ilvl w:val="0"/>
-                <w:numId w:val="6"/>
-              </w:numPr>
-              <w:spacing w:before="120" w:after="120"/>
-              <w:ind w:left="294" w:hanging="284"/>
-              <w:jc w:val="both"/>
-              <w:rPr>
-                <w:rFonts w:ascii="Tahoma" w:eastAsia="Tahoma" w:hAnsi="Tahoma" w:cs="Tahoma"/>
-                <w:i/>
-              </w:rPr>
-            </w:pPr>
-            <w:r>
-              <w:rPr>
-                <w:rFonts w:ascii="Tahoma" w:eastAsia="Tahoma" w:hAnsi="Tahoma" w:cs="Tahoma"/>
-                <w:b/>
-              </w:rPr>
+            <w:r>
               <w:t>Penyajian</w:t>
             </w:r>
           </w:p>
@@ -1276,46 +915,9 @@
             <w:vAlign w:val="center"/>
           </w:tcPr>
           <w:p>
-            <w:pPr>
-              <w:jc w:val="center"/>
-              <w:rPr>
-                <w:rFonts w:ascii="Tahoma" w:eastAsia="Tahoma" w:hAnsi="Tahoma" w:cs="Tahoma"/>
-                <w:b/>
-                <w:sz w:val="22"/>
-                <w:szCs w:val="22"/>
-              </w:rPr>
-            </w:pPr>
-          </w:p>
-          <w:p>
-            <w:pPr>
-              <w:jc w:val="center"/>
-              <w:rPr>
-                <w:rFonts w:ascii="Tahoma" w:eastAsia="Tahoma" w:hAnsi="Tahoma" w:cs="Tahoma"/>
-                <w:b/>
-                <w:sz w:val="22"/>
-                <w:szCs w:val="22"/>
-              </w:rPr>
-            </w:pPr>
-            <w:r>
-              <w:rPr>
-                <w:rFonts w:ascii="Tahoma" w:eastAsia="Tahoma" w:hAnsi="Tahoma" w:cs="Tahoma"/>
-                <w:b/>
-                <w:sz w:val="22"/>
-                <w:szCs w:val="22"/>
-              </w:rPr>
+            <w:r>
               <w:t>Sub Judul</w:t>
             </w:r>
-          </w:p>
-          <w:p>
-            <w:pPr>
-              <w:jc w:val="center"/>
-              <w:rPr>
-                <w:rFonts w:ascii="Tahoma" w:eastAsia="Tahoma" w:hAnsi="Tahoma" w:cs="Tahoma"/>
-                <w:i/>
-                <w:sz w:val="22"/>
-                <w:szCs w:val="22"/>
-              </w:rPr>
-            </w:pPr>
           </w:p>
         </w:tc>
         <w:tc>
@@ -1325,46 +927,9 @@
             <w:vAlign w:val="center"/>
           </w:tcPr>
           <w:p>
-            <w:pPr>
-              <w:jc w:val="center"/>
-              <w:rPr>
-                <w:rFonts w:ascii="Tahoma" w:eastAsia="Tahoma" w:hAnsi="Tahoma" w:cs="Tahoma"/>
-                <w:b/>
-                <w:sz w:val="22"/>
-                <w:szCs w:val="22"/>
-              </w:rPr>
-            </w:pPr>
-          </w:p>
-          <w:p>
-            <w:pPr>
-              <w:jc w:val="center"/>
-              <w:rPr>
-                <w:rFonts w:ascii="Tahoma" w:eastAsia="Tahoma" w:hAnsi="Tahoma" w:cs="Tahoma"/>
-                <w:b/>
-                <w:sz w:val="22"/>
-                <w:szCs w:val="22"/>
-              </w:rPr>
-            </w:pPr>
-            <w:r>
-              <w:rPr>
-                <w:rFonts w:ascii="Tahoma" w:eastAsia="Tahoma" w:hAnsi="Tahoma" w:cs="Tahoma"/>
-                <w:b/>
-                <w:sz w:val="22"/>
-                <w:szCs w:val="22"/>
-              </w:rPr>
+            <w:r>
               <w:t>Uraian Kegiatan</w:t>
             </w:r>
-          </w:p>
-          <w:p>
-            <w:pPr>
-              <w:jc w:val="center"/>
-              <w:rPr>
-                <w:rFonts w:ascii="Tahoma" w:eastAsia="Tahoma" w:hAnsi="Tahoma" w:cs="Tahoma"/>
-                <w:i/>
-                <w:sz w:val="22"/>
-                <w:szCs w:val="22"/>
-              </w:rPr>
-            </w:pPr>
           </w:p>
         </w:tc>
         <w:tc>
@@ -1374,21 +939,7 @@
             <w:vAlign w:val="center"/>
           </w:tcPr>
           <w:p>
-            <w:pPr>
-              <w:jc w:val="center"/>
-              <w:rPr>
-                <w:rFonts w:ascii="Tahoma" w:eastAsia="Tahoma" w:hAnsi="Tahoma" w:cs="Tahoma"/>
-                <w:sz w:val="22"/>
-                <w:szCs w:val="22"/>
-              </w:rPr>
-            </w:pPr>
-            <w:r>
-              <w:rPr>
-                <w:rFonts w:ascii="Tahoma" w:eastAsia="Tahoma" w:hAnsi="Tahoma" w:cs="Tahoma"/>
-                <w:b/>
-                <w:sz w:val="22"/>
-                <w:szCs w:val="22"/>
-              </w:rPr>
+            <w:r>
               <w:t>Media Pembelajaran</w:t>
             </w:r>
           </w:p>
@@ -1399,32 +950,8 @@
             <w:vAlign w:val="center"/>
           </w:tcPr>
           <w:p>
-            <w:pPr>
-              <w:jc w:val="center"/>
-              <w:rPr>
-                <w:rFonts w:ascii="Tahoma" w:eastAsia="Tahoma" w:hAnsi="Tahoma" w:cs="Tahoma"/>
-                <w:i/>
-                <w:sz w:val="22"/>
-                <w:szCs w:val="22"/>
-              </w:rPr>
-            </w:pPr>
-            <w:r>
-              <w:rPr>
-                <w:rFonts w:ascii="Tahoma" w:eastAsia="Tahoma" w:hAnsi="Tahoma" w:cs="Tahoma"/>
-                <w:b/>
-                <w:sz w:val="22"/>
-                <w:szCs w:val="22"/>
-              </w:rPr>
+            <w:r>
               <w:t>Perkiraan Waktu</w:t>
-            </w:r>
-            <w:r>
-              <w:rPr>
-                <w:rFonts w:ascii="Tahoma" w:eastAsia="Tahoma" w:hAnsi="Tahoma" w:cs="Tahoma"/>
-                <w:i/>
-                <w:sz w:val="22"/>
-                <w:szCs w:val="22"/>
-              </w:rPr>
-              <w:t xml:space="preserve"> </w:t>
             </w:r>
           </w:p>
         </w:tc>
@@ -1442,7 +969,7 @@
           </w:tcPr>
           <w:p>
             <w:r>
-              <w:t>Konsep Prototipe</w:t>
+              <w:t>Konsep Prototipe Desain Grafis</w:t>
             </w:r>
           </w:p>
         </w:tc>
@@ -1453,7 +980,17 @@
           </w:tcPr>
           <w:p>
             <w:r>
-              <w:t>Tahapan memilih media dan menelaah informasi kunci dari design brief.</w:t>
+              <w:t>Instruktur menjelaskan kepada peserta terkait:</w:t>
+              <w:br/>
+              <w:t>- Pengertian prototipe dalam desain grafis</w:t>
+              <w:br/>
+              <w:t>- Design brief sebagai acuan: konsep, tujuan, konten, target audiens</w:t>
+              <w:br/>
+              <w:t>- Tahap memilih media/wadah karya desain</w:t>
+              <w:br/>
+              <w:t>- Cara menelaah informasi kunci pada design brief</w:t>
+              <w:br/>
+              <w:t>Instruktur menanyakan kepada peserta apakah materi telah dipahami dan membuka sesi tanya jawab.</w:t>
             </w:r>
           </w:p>
         </w:tc>
@@ -1463,23 +1000,9 @@
             <w:gridSpan w:val="3"/>
           </w:tcPr>
           <w:p>
-            <w:pPr>
-              <w:pBdr>
-                <w:top w:val="nil"/>
-                <w:left w:val="nil"/>
-                <w:bottom w:val="nil"/>
-                <w:right w:val="nil"/>
-                <w:between w:val="nil"/>
-              </w:pBdr>
-              <w:spacing w:before="60" w:line="276" w:lineRule="auto"/>
-              <w:ind w:left="253" w:right="89"/>
-              <w:rPr>
-                <w:rFonts w:ascii="Tahoma" w:eastAsia="Tahoma" w:hAnsi="Tahoma" w:cs="Tahoma"/>
-                <w:color w:val="000000"/>
-                <w:sz w:val="22"/>
-                <w:szCs w:val="22"/>
-              </w:rPr>
-            </w:pPr>
+            <w:r>
+              <w:t>Power Point, Gambar dan Video</w:t>
+            </w:r>
           </w:p>
         </w:tc>
         <w:tc>
@@ -1487,15 +1010,9 @@
             <w:tcW w:w="1850" w:type="dxa"/>
           </w:tcPr>
           <w:p>
-            <w:pPr>
-              <w:spacing w:before="60"/>
-              <w:jc w:val="center"/>
-              <w:rPr>
-                <w:rFonts w:ascii="Tahoma" w:eastAsia="Tahoma" w:hAnsi="Tahoma" w:cs="Tahoma"/>
-                <w:sz w:val="22"/>
-                <w:szCs w:val="22"/>
-              </w:rPr>
-            </w:pPr>
+            <w:r>
+              <w:t>35 menit</w:t>
+            </w:r>
           </w:p>
         </w:tc>
       </w:tr>
@@ -1512,7 +1029,7 @@
           </w:tcPr>
           <w:p>
             <w:r>
-              <w:t>Demo Pembuatan Thumbnail</w:t>
+              <w:t>Brainstorming &amp; Pembuatan Thumbnail</w:t>
             </w:r>
           </w:p>
         </w:tc>
@@ -1523,7 +1040,17 @@
           </w:tcPr>
           <w:p>
             <w:r>
-              <w:t>Teknik sketsa cepat (margin &amp; grid) untuk memvisualisasikan ide.</w:t>
+              <w:t>Instruktur menjelaskan &amp; mendemonstrasikan kepada peserta terkait:</w:t>
+              <w:br/>
+              <w:t>- Mengumpulkan dan mengelompokkan konten teks &amp; gambar</w:t>
+              <w:br/>
+              <w:t>- Menentukan prioritas konten</w:t>
+              <w:br/>
+              <w:t>- Mencari referensi &amp; pembanding desain</w:t>
+              <w:br/>
+              <w:t>- Teknik membuat thumbnail sketsa (margin &amp; grid)</w:t>
+              <w:br/>
+              <w:t>Instruktur membuka sesi tanya jawab.</w:t>
             </w:r>
           </w:p>
         </w:tc>
@@ -1533,23 +1060,9 @@
             <w:gridSpan w:val="3"/>
           </w:tcPr>
           <w:p>
-            <w:pPr>
-              <w:pBdr>
-                <w:top w:val="nil"/>
-                <w:left w:val="nil"/>
-                <w:bottom w:val="nil"/>
-                <w:right w:val="nil"/>
-                <w:between w:val="nil"/>
-              </w:pBdr>
-              <w:spacing w:before="60" w:line="276" w:lineRule="auto"/>
-              <w:ind w:left="253" w:right="89"/>
-              <w:rPr>
-                <w:rFonts w:ascii="Tahoma" w:eastAsia="Tahoma" w:hAnsi="Tahoma" w:cs="Tahoma"/>
-                <w:color w:val="000000"/>
-                <w:sz w:val="22"/>
-                <w:szCs w:val="22"/>
-              </w:rPr>
-            </w:pPr>
+            <w:r>
+              <w:t>Power Point, Gambar dan Video</w:t>
+            </w:r>
           </w:p>
         </w:tc>
         <w:tc>
@@ -1557,15 +1070,9 @@
             <w:tcW w:w="1850" w:type="dxa"/>
           </w:tcPr>
           <w:p>
-            <w:pPr>
-              <w:spacing w:before="60"/>
-              <w:jc w:val="center"/>
-              <w:rPr>
-                <w:rFonts w:ascii="Tahoma" w:eastAsia="Tahoma" w:hAnsi="Tahoma" w:cs="Tahoma"/>
-                <w:sz w:val="22"/>
-                <w:szCs w:val="22"/>
-              </w:rPr>
-            </w:pPr>
+            <w:r>
+              <w:t>35 menit</w:t>
+            </w:r>
           </w:p>
         </w:tc>
       </w:tr>
@@ -1582,7 +1089,7 @@
           </w:tcPr>
           <w:p>
             <w:r>
-              <w:t>Praktik Sketsa &amp; Mockup</w:t>
+              <w:t>Praktik Sketsa Thumbnail &amp; Prototipe Digital</w:t>
             </w:r>
           </w:p>
         </w:tc>
@@ -1593,7 +1100,15 @@
           </w:tcPr>
           <w:p>
             <w:r>
-              <w:t>Membuat 3 alternatif sketsa dan memindahkannya ke software desain.</w:t>
+              <w:t>Instruktur memberikan jobsheet dan mendampingi peserta untuk:</w:t>
+              <w:br/>
+              <w:t>- Membuat minimal 3 alternatif thumbnail di buku sketsa sesuai design brief</w:t>
+              <w:br/>
+              <w:t>- Menentukan margin &amp; grid, menyusun konten berdasarkan prioritas</w:t>
+              <w:br/>
+              <w:t>- Memilih 1 thumbnail terbaik dan mentransfernya menjadi prototipe digital</w:t>
+              <w:br/>
+              <w:t>Instruktur berkeliling memberikan pendampingan dan umpan balik.</w:t>
             </w:r>
           </w:p>
         </w:tc>
@@ -1603,23 +1118,9 @@
             <w:gridSpan w:val="3"/>
           </w:tcPr>
           <w:p>
-            <w:pPr>
-              <w:pBdr>
-                <w:top w:val="nil"/>
-                <w:left w:val="nil"/>
-                <w:bottom w:val="nil"/>
-                <w:right w:val="nil"/>
-                <w:between w:val="nil"/>
-              </w:pBdr>
-              <w:spacing w:before="60" w:line="276" w:lineRule="auto"/>
-              <w:ind w:left="253" w:right="89"/>
-              <w:rPr>
-                <w:rFonts w:ascii="Tahoma" w:eastAsia="Tahoma" w:hAnsi="Tahoma" w:cs="Tahoma"/>
-                <w:color w:val="000000"/>
-                <w:sz w:val="22"/>
-                <w:szCs w:val="22"/>
-              </w:rPr>
-            </w:pPr>
+            <w:r>
+              <w:t>Buku Sketsa, Pensil &amp; PC Lab (Jobsheet 06)</w:t>
+            </w:r>
           </w:p>
         </w:tc>
         <w:tc>
@@ -1627,15 +1128,9 @@
             <w:tcW w:w="1850" w:type="dxa"/>
           </w:tcPr>
           <w:p>
-            <w:pPr>
-              <w:spacing w:before="60"/>
-              <w:jc w:val="center"/>
-              <w:rPr>
-                <w:rFonts w:ascii="Tahoma" w:eastAsia="Tahoma" w:hAnsi="Tahoma" w:cs="Tahoma"/>
-                <w:sz w:val="22"/>
-                <w:szCs w:val="22"/>
-              </w:rPr>
-            </w:pPr>
+            <w:r>
+              <w:t>35 menit</w:t>
+            </w:r>
           </w:p>
         </w:tc>
       </w:tr>
@@ -1651,24 +1146,7 @@
             <w:gridSpan w:val="3"/>
           </w:tcPr>
           <w:p>
-            <w:pPr>
-              <w:pStyle w:val="ListParagraph"/>
-              <w:numPr>
-                <w:ilvl w:val="3"/>
-                <w:numId w:val="5"/>
-              </w:numPr>
-              <w:spacing w:before="60"/>
-              <w:ind w:left="292"/>
-              <w:rPr>
-                <w:rFonts w:ascii="Tahoma" w:eastAsia="Tahoma" w:hAnsi="Tahoma" w:cs="Tahoma"/>
-                <w:b/>
-              </w:rPr>
-            </w:pPr>
-            <w:r>
-              <w:rPr>
-                <w:rFonts w:ascii="Tahoma" w:eastAsia="Tahoma" w:hAnsi="Tahoma" w:cs="Tahoma"/>
-                <w:b/>
-              </w:rPr>
+            <w:r>
               <w:t>Kesimpulan ( Summary)</w:t>
             </w:r>
           </w:p>
@@ -1680,7 +1158,7 @@
           </w:tcPr>
           <w:p>
             <w:r>
-              <w:t>Thumbnail sebagai acuan desain.</w:t>
+              <w:t>Instruktur menyimpulkan tentang konsep prototipe desain grafis, tahapan pengembangan sketsa menjadi prototipe, dan pentingnya thumbnail sebagai acuan desain.</w:t>
             </w:r>
           </w:p>
         </w:tc>
@@ -1690,23 +1168,9 @@
             <w:gridSpan w:val="3"/>
           </w:tcPr>
           <w:p>
-            <w:pPr>
-              <w:pBdr>
-                <w:top w:val="nil"/>
-                <w:left w:val="nil"/>
-                <w:bottom w:val="nil"/>
-                <w:right w:val="nil"/>
-                <w:between w:val="nil"/>
-              </w:pBdr>
-              <w:spacing w:before="60" w:line="276" w:lineRule="auto"/>
-              <w:ind w:left="253" w:right="89"/>
-              <w:rPr>
-                <w:rFonts w:ascii="Tahoma" w:eastAsia="Tahoma" w:hAnsi="Tahoma" w:cs="Tahoma"/>
-                <w:color w:val="000000"/>
-                <w:sz w:val="22"/>
-                <w:szCs w:val="22"/>
-              </w:rPr>
-            </w:pPr>
+            <w:r>
+              <w:t>Power Point</w:t>
+            </w:r>
           </w:p>
         </w:tc>
         <w:tc>
@@ -1714,15 +1178,9 @@
             <w:tcW w:w="1850" w:type="dxa"/>
           </w:tcPr>
           <w:p>
-            <w:pPr>
-              <w:spacing w:before="60"/>
-              <w:jc w:val="center"/>
-              <w:rPr>
-                <w:rFonts w:ascii="Tahoma" w:eastAsia="Tahoma" w:hAnsi="Tahoma" w:cs="Tahoma"/>
-                <w:sz w:val="22"/>
-                <w:szCs w:val="22"/>
-              </w:rPr>
-            </w:pPr>
+            <w:r>
+              <w:t>5 menit</w:t>
+            </w:r>
           </w:p>
         </w:tc>
       </w:tr>
@@ -1739,25 +1197,7 @@
             <w:vAlign w:val="center"/>
           </w:tcPr>
           <w:p>
-            <w:pPr>
-              <w:pStyle w:val="ListParagraph"/>
-              <w:numPr>
-                <w:ilvl w:val="0"/>
-                <w:numId w:val="6"/>
-              </w:numPr>
-              <w:spacing w:before="120" w:after="120"/>
-              <w:ind w:left="436" w:hanging="426"/>
-              <w:jc w:val="both"/>
-              <w:rPr>
-                <w:rFonts w:ascii="Tahoma" w:eastAsia="Tahoma" w:hAnsi="Tahoma" w:cs="Tahoma"/>
-                <w:b/>
-              </w:rPr>
-            </w:pPr>
-            <w:r>
-              <w:rPr>
-                <w:rFonts w:ascii="Tahoma" w:eastAsia="Tahoma" w:hAnsi="Tahoma" w:cs="Tahoma"/>
-                <w:b/>
-              </w:rPr>
+            <w:r>
               <w:t>Aplikasi</w:t>
             </w:r>
           </w:p>
@@ -1769,7 +1209,161 @@
           </w:tcPr>
           <w:p>
             <w:r>
-              <w:t>Kuis alur prototipe.</w:t>
+              <w:t>Instruktur memberikan pertanyaan kepada peserta menggunakan Quizizz untuk mengukur pemahaman peserta terhadap materi prototipe.</w:t>
+            </w:r>
+          </w:p>
+        </w:tc>
+        <w:tc>
+          <w:tcPr>
+            <w:tcW w:w="1796" w:type="dxa"/>
+            <w:gridSpan w:val="3"/>
+          </w:tcPr>
+          <w:p>
+            <w:r>
+              <w:t>Quizizz.com / Form</w:t>
+            </w:r>
+          </w:p>
+        </w:tc>
+        <w:tc>
+          <w:tcPr>
+            <w:tcW w:w="1850" w:type="dxa"/>
+          </w:tcPr>
+          <w:p>
+            <w:r>
+              <w:t>20 menit</w:t>
+            </w:r>
+          </w:p>
+        </w:tc>
+      </w:tr>
+      <w:tr>
+        <w:trPr>
+          <w:gridAfter w:val="1"/>
+          <w:wAfter w:w="10" w:type="dxa"/>
+          <w:trHeight w:val="306"/>
+        </w:trPr>
+        <w:tc>
+          <w:tcPr>
+            <w:tcW w:w="2665" w:type="dxa"/>
+            <w:gridSpan w:val="3"/>
+            <w:vAlign w:val="center"/>
+          </w:tcPr>
+          <w:p>
+            <w:r>
+              <w:t>Evaluasi</w:t>
+            </w:r>
+          </w:p>
+        </w:tc>
+        <w:tc>
+          <w:tcPr>
+            <w:tcW w:w="3543" w:type="dxa"/>
+            <w:gridSpan w:val="2"/>
+          </w:tcPr>
+          <w:p>
+            <w:r>
+              <w:t>Instruktur membagikan lembar jobsheet 06 kepada peserta pelatihan untuk menyelesaikan tugas pengembangan prototipe.</w:t>
+            </w:r>
+          </w:p>
+        </w:tc>
+        <w:tc>
+          <w:tcPr>
+            <w:tcW w:w="1796" w:type="dxa"/>
+            <w:gridSpan w:val="3"/>
+          </w:tcPr>
+          <w:p>
+            <w:r>
+              <w:t>Lembar Jobsheet 06 &amp; Rubrik</w:t>
+            </w:r>
+          </w:p>
+        </w:tc>
+        <w:tc>
+          <w:tcPr>
+            <w:tcW w:w="1850" w:type="dxa"/>
+          </w:tcPr>
+          <w:p>
+            <w:r>
+              <w:t>30 menit</w:t>
+            </w:r>
+          </w:p>
+        </w:tc>
+      </w:tr>
+      <w:tr>
+        <w:trPr>
+          <w:gridAfter w:val="1"/>
+          <w:wAfter w:w="10" w:type="dxa"/>
+          <w:trHeight w:val="587"/>
+        </w:trPr>
+        <w:tc>
+          <w:tcPr>
+            <w:tcW w:w="2665" w:type="dxa"/>
+            <w:gridSpan w:val="3"/>
+            <w:vAlign w:val="center"/>
+          </w:tcPr>
+          <w:p>
+            <w:r>
+              <w:t>Tugas Tambahan</w:t>
+            </w:r>
+          </w:p>
+        </w:tc>
+        <w:tc>
+          <w:tcPr>
+            <w:tcW w:w="3543" w:type="dxa"/>
+            <w:gridSpan w:val="2"/>
+          </w:tcPr>
+          <w:p>
+            <w:r>
+              <w:t>Instruktur memberikan tugas tambahan: Mengembangkan thumbnail terpilih menjadi prototipe digital/mockup 1 layout di software desain.</w:t>
+            </w:r>
+          </w:p>
+        </w:tc>
+        <w:tc>
+          <w:tcPr>
+            <w:tcW w:w="1796" w:type="dxa"/>
+            <w:gridSpan w:val="3"/>
+          </w:tcPr>
+          <w:p>
+            <w:r>
+              <w:t>Instruktur memberikan tugas tambahan: Mengembangkan thumbnail terpilih menjadi prototipe digital/mockup 1 layout di software desain.</w:t>
+            </w:r>
+          </w:p>
+        </w:tc>
+        <w:tc>
+          <w:tcPr>
+            <w:tcW w:w="1850" w:type="dxa"/>
+          </w:tcPr>
+          <w:p>
+            <w:r>
+              <w:t>5 menit</w:t>
+            </w:r>
+          </w:p>
+        </w:tc>
+      </w:tr>
+      <w:tr>
+        <w:trPr>
+          <w:gridAfter w:val="1"/>
+          <w:wAfter w:w="10" w:type="dxa"/>
+        </w:trPr>
+        <w:tc>
+          <w:tcPr>
+            <w:tcW w:w="2665" w:type="dxa"/>
+            <w:gridSpan w:val="3"/>
+            <w:vAlign w:val="center"/>
+          </w:tcPr>
+          <w:p>
+            <w:r>
+              <w:t>Pemberesan Kelas</w:t>
+            </w:r>
+          </w:p>
+        </w:tc>
+        <w:tc>
+          <w:tcPr>
+            <w:tcW w:w="3543" w:type="dxa"/>
+            <w:gridSpan w:val="2"/>
+          </w:tcPr>
+          <w:p>
+            <w:r>
+              <w:t>Merapikan perangkat PC dan ruang lab (5R)</w:t>
+              <w:br/>
+              <w:t>Berdoa dan memberikan salam penutup</w:t>
             </w:r>
           </w:p>
         </w:tc>
@@ -1807,349 +1401,9 @@
             <w:tcW w:w="1850" w:type="dxa"/>
           </w:tcPr>
           <w:p>
-            <w:pPr>
-              <w:pBdr>
-                <w:top w:val="nil"/>
-                <w:left w:val="nil"/>
-                <w:bottom w:val="nil"/>
-                <w:right w:val="nil"/>
-                <w:between w:val="nil"/>
-              </w:pBdr>
-              <w:spacing w:before="60"/>
-              <w:jc w:val="center"/>
-              <w:rPr>
-                <w:rFonts w:ascii="Tahoma" w:eastAsia="Tahoma" w:hAnsi="Tahoma" w:cs="Tahoma"/>
-                <w:sz w:val="22"/>
-                <w:szCs w:val="22"/>
-              </w:rPr>
-            </w:pPr>
-          </w:p>
-        </w:tc>
-      </w:tr>
-      <w:tr>
-        <w:trPr>
-          <w:gridAfter w:val="1"/>
-          <w:wAfter w:w="10" w:type="dxa"/>
-          <w:trHeight w:val="306"/>
-        </w:trPr>
-        <w:tc>
-          <w:tcPr>
-            <w:tcW w:w="2665" w:type="dxa"/>
-            <w:gridSpan w:val="3"/>
-            <w:vAlign w:val="center"/>
-          </w:tcPr>
-          <w:p>
-            <w:pPr>
-              <w:pStyle w:val="ListParagraph"/>
-              <w:numPr>
-                <w:ilvl w:val="0"/>
-                <w:numId w:val="6"/>
-              </w:numPr>
-              <w:spacing w:before="120" w:after="120"/>
-              <w:ind w:left="436" w:hanging="426"/>
-              <w:jc w:val="both"/>
-              <w:rPr>
-                <w:rFonts w:ascii="Tahoma" w:eastAsia="Tahoma" w:hAnsi="Tahoma" w:cs="Tahoma"/>
-                <w:b/>
-              </w:rPr>
-            </w:pPr>
-            <w:r>
-              <w:rPr>
-                <w:rFonts w:ascii="Tahoma" w:eastAsia="Tahoma" w:hAnsi="Tahoma" w:cs="Tahoma"/>
-                <w:b/>
-              </w:rPr>
-              <w:t>Evaluasi</w:t>
-            </w:r>
-          </w:p>
-        </w:tc>
-        <w:tc>
-          <w:tcPr>
-            <w:tcW w:w="3543" w:type="dxa"/>
-            <w:gridSpan w:val="2"/>
-          </w:tcPr>
-          <w:p>
-            <w:r>
-              <w:t>Jobsheet 06: Prototipe Desain.</w:t>
-            </w:r>
-          </w:p>
-        </w:tc>
-        <w:tc>
-          <w:tcPr>
-            <w:tcW w:w="1796" w:type="dxa"/>
-            <w:gridSpan w:val="3"/>
-          </w:tcPr>
-          <w:p>
-            <w:pPr>
-              <w:numPr>
-                <w:ilvl w:val="0"/>
-                <w:numId w:val="4"/>
-              </w:numPr>
-              <w:pBdr>
-                <w:top w:val="nil"/>
-                <w:left w:val="nil"/>
-                <w:bottom w:val="nil"/>
-                <w:right w:val="nil"/>
-                <w:between w:val="nil"/>
-              </w:pBdr>
-              <w:spacing w:before="60" w:line="276" w:lineRule="auto"/>
-              <w:ind w:left="253" w:right="89" w:hanging="220"/>
-              <w:rPr>
-                <w:rFonts w:ascii="Tahoma" w:eastAsia="Tahoma" w:hAnsi="Tahoma" w:cs="Tahoma"/>
-                <w:color w:val="000000"/>
-                <w:sz w:val="22"/>
-                <w:szCs w:val="22"/>
-              </w:rPr>
-            </w:pPr>
-          </w:p>
-        </w:tc>
-        <w:tc>
-          <w:tcPr>
-            <w:tcW w:w="1850" w:type="dxa"/>
-          </w:tcPr>
-          <w:p>
-            <w:pPr>
-              <w:pBdr>
-                <w:top w:val="nil"/>
-                <w:left w:val="nil"/>
-                <w:bottom w:val="nil"/>
-                <w:right w:val="nil"/>
-                <w:between w:val="nil"/>
-              </w:pBdr>
-              <w:spacing w:before="60"/>
-              <w:jc w:val="center"/>
-              <w:rPr>
-                <w:rFonts w:ascii="Tahoma" w:eastAsia="Tahoma" w:hAnsi="Tahoma" w:cs="Tahoma"/>
-                <w:sz w:val="22"/>
-                <w:szCs w:val="22"/>
-              </w:rPr>
-            </w:pPr>
-          </w:p>
-        </w:tc>
-      </w:tr>
-      <w:tr>
-        <w:trPr>
-          <w:gridAfter w:val="1"/>
-          <w:wAfter w:w="10" w:type="dxa"/>
-          <w:trHeight w:val="587"/>
-        </w:trPr>
-        <w:tc>
-          <w:tcPr>
-            <w:tcW w:w="2665" w:type="dxa"/>
-            <w:gridSpan w:val="3"/>
-            <w:vAlign w:val="center"/>
-          </w:tcPr>
-          <w:p>
-            <w:pPr>
-              <w:spacing w:before="120" w:after="120"/>
-              <w:jc w:val="both"/>
-              <w:rPr>
-                <w:rFonts w:ascii="Tahoma" w:eastAsia="Tahoma" w:hAnsi="Tahoma" w:cs="Tahoma"/>
-                <w:b/>
-                <w:sz w:val="22"/>
-                <w:szCs w:val="22"/>
-              </w:rPr>
-            </w:pPr>
-            <w:r>
-              <w:rPr>
-                <w:rFonts w:ascii="Tahoma" w:eastAsia="Tahoma" w:hAnsi="Tahoma" w:cs="Tahoma"/>
-                <w:b/>
-                <w:sz w:val="22"/>
-                <w:szCs w:val="22"/>
-              </w:rPr>
-              <w:t>Tugas Tambahan</w:t>
-            </w:r>
-          </w:p>
-        </w:tc>
-        <w:tc>
-          <w:tcPr>
-            <w:tcW w:w="3543" w:type="dxa"/>
-            <w:gridSpan w:val="2"/>
-          </w:tcPr>
-          <w:p>
-            <w:pPr>
-              <w:numPr>
-                <w:ilvl w:val="0"/>
-                <w:numId w:val="4"/>
-              </w:numPr>
-              <w:pBdr>
-                <w:top w:val="nil"/>
-                <w:left w:val="nil"/>
-                <w:bottom w:val="nil"/>
-                <w:right w:val="nil"/>
-                <w:between w:val="nil"/>
-              </w:pBdr>
-              <w:spacing w:before="60" w:line="276" w:lineRule="auto"/>
-              <w:ind w:left="253" w:right="89" w:hanging="220"/>
-              <w:rPr>
-                <w:rFonts w:ascii="Tahoma" w:eastAsia="Tahoma" w:hAnsi="Tahoma" w:cs="Tahoma"/>
-                <w:color w:val="000000"/>
-                <w:sz w:val="22"/>
-                <w:szCs w:val="22"/>
-              </w:rPr>
-            </w:pPr>
-          </w:p>
-        </w:tc>
-        <w:tc>
-          <w:tcPr>
-            <w:tcW w:w="1796" w:type="dxa"/>
-            <w:gridSpan w:val="3"/>
-          </w:tcPr>
-          <w:p>
-            <w:pPr>
-              <w:pBdr>
-                <w:top w:val="nil"/>
-                <w:left w:val="nil"/>
-                <w:bottom w:val="nil"/>
-                <w:right w:val="nil"/>
-                <w:between w:val="nil"/>
-              </w:pBdr>
-              <w:spacing w:before="60" w:line="276" w:lineRule="auto"/>
-              <w:ind w:left="33" w:right="89"/>
-              <w:rPr>
-                <w:rFonts w:ascii="Tahoma" w:eastAsia="Tahoma" w:hAnsi="Tahoma" w:cs="Tahoma"/>
-                <w:color w:val="000000"/>
-                <w:sz w:val="22"/>
-                <w:szCs w:val="22"/>
-              </w:rPr>
-            </w:pPr>
-          </w:p>
-        </w:tc>
-        <w:tc>
-          <w:tcPr>
-            <w:tcW w:w="1850" w:type="dxa"/>
-          </w:tcPr>
-          <w:p>
-            <w:pPr>
-              <w:pBdr>
-                <w:top w:val="nil"/>
-                <w:left w:val="nil"/>
-                <w:bottom w:val="nil"/>
-                <w:right w:val="nil"/>
-                <w:between w:val="nil"/>
-              </w:pBdr>
-              <w:spacing w:before="60"/>
-              <w:jc w:val="center"/>
-              <w:rPr>
-                <w:rFonts w:ascii="Tahoma" w:eastAsia="Tahoma" w:hAnsi="Tahoma" w:cs="Tahoma"/>
-                <w:sz w:val="22"/>
-                <w:szCs w:val="22"/>
-              </w:rPr>
-            </w:pPr>
-          </w:p>
-        </w:tc>
-      </w:tr>
-      <w:tr>
-        <w:trPr>
-          <w:gridAfter w:val="1"/>
-          <w:wAfter w:w="10" w:type="dxa"/>
-        </w:trPr>
-        <w:tc>
-          <w:tcPr>
-            <w:tcW w:w="2665" w:type="dxa"/>
-            <w:gridSpan w:val="3"/>
-            <w:vAlign w:val="center"/>
-          </w:tcPr>
-          <w:p>
-            <w:pPr>
-              <w:spacing w:before="120" w:after="120"/>
-              <w:jc w:val="both"/>
-              <w:rPr>
-                <w:rFonts w:ascii="Tahoma" w:eastAsia="Tahoma" w:hAnsi="Tahoma" w:cs="Tahoma"/>
-                <w:b/>
-                <w:sz w:val="22"/>
-                <w:szCs w:val="22"/>
-              </w:rPr>
-            </w:pPr>
-            <w:r>
-              <w:rPr>
-                <w:rFonts w:ascii="Tahoma" w:eastAsia="Tahoma" w:hAnsi="Tahoma" w:cs="Tahoma"/>
-                <w:b/>
-                <w:sz w:val="22"/>
-                <w:szCs w:val="22"/>
-              </w:rPr>
-              <w:t>Pemberesan Kelas</w:t>
-            </w:r>
-          </w:p>
-        </w:tc>
-        <w:tc>
-          <w:tcPr>
-            <w:tcW w:w="3543" w:type="dxa"/>
-            <w:gridSpan w:val="2"/>
-          </w:tcPr>
-          <w:p>
-            <w:pPr>
-              <w:numPr>
-                <w:ilvl w:val="0"/>
-                <w:numId w:val="4"/>
-              </w:numPr>
-              <w:pBdr>
-                <w:top w:val="nil"/>
-                <w:left w:val="nil"/>
-                <w:bottom w:val="nil"/>
-                <w:right w:val="nil"/>
-                <w:between w:val="nil"/>
-              </w:pBdr>
-              <w:spacing w:before="60" w:line="276" w:lineRule="auto"/>
-              <w:ind w:left="253" w:right="89" w:hanging="220"/>
-              <w:rPr>
-                <w:rFonts w:ascii="Tahoma" w:eastAsia="Tahoma" w:hAnsi="Tahoma" w:cs="Tahoma"/>
-                <w:color w:val="000000"/>
-                <w:sz w:val="22"/>
-                <w:szCs w:val="22"/>
-              </w:rPr>
-            </w:pPr>
-          </w:p>
-        </w:tc>
-        <w:tc>
-          <w:tcPr>
-            <w:tcW w:w="1796" w:type="dxa"/>
-            <w:gridSpan w:val="3"/>
-          </w:tcPr>
-          <w:p>
-            <w:pPr>
-              <w:numPr>
-                <w:ilvl w:val="0"/>
-                <w:numId w:val="4"/>
-              </w:numPr>
-              <w:pBdr>
-                <w:top w:val="nil"/>
-                <w:left w:val="nil"/>
-                <w:bottom w:val="nil"/>
-                <w:right w:val="nil"/>
-                <w:between w:val="nil"/>
-              </w:pBdr>
-              <w:spacing w:before="60" w:line="276" w:lineRule="auto"/>
-              <w:ind w:left="253" w:right="89" w:hanging="220"/>
-              <w:rPr>
-                <w:rFonts w:ascii="Tahoma" w:eastAsia="Tahoma" w:hAnsi="Tahoma" w:cs="Tahoma"/>
-                <w:color w:val="000000"/>
-                <w:sz w:val="22"/>
-                <w:szCs w:val="22"/>
-              </w:rPr>
-            </w:pPr>
-          </w:p>
-        </w:tc>
-        <w:tc>
-          <w:tcPr>
-            <w:tcW w:w="1850" w:type="dxa"/>
-          </w:tcPr>
-          <w:p>
-            <w:pPr>
-              <w:pBdr>
-                <w:top w:val="nil"/>
-                <w:left w:val="nil"/>
-                <w:bottom w:val="nil"/>
-                <w:right w:val="nil"/>
-                <w:between w:val="nil"/>
-              </w:pBdr>
-              <w:spacing w:before="60"/>
-              <w:jc w:val="center"/>
-              <w:rPr>
-                <w:rFonts w:ascii="Tahoma" w:eastAsia="Tahoma" w:hAnsi="Tahoma" w:cs="Tahoma"/>
-                <w:sz w:val="22"/>
-                <w:szCs w:val="22"/>
-              </w:rPr>
-            </w:pPr>
+            <w:r>
+              <w:t>5 menit</w:t>
+            </w:r>
           </w:p>
         </w:tc>
       </w:tr>

</xml_diff>